<commit_message>
wip(parse): phien 4 - mau txt/docx, UI va loi cu phap + * Co-authored-by: monkeycode-ai <monkeycode-ai@chaitin.com>
</commit_message>
<xml_diff>
--- a/public/templates/mau-cau-hoi.docx
+++ b/public/templates/mau-cau-hoi.docx
@@ -7,7 +7,7 @@
         <w:pStyle w:val="Heading3"/>
       </w:pPr>
       <w:r>
-        <w:t xml:space="preserve">// HƯỚNG DẪN: Gạch chân từ để tạo ô điền khuyết cố định. Đặt từ trong "dấu nháy kép" để tạo ô hoán đổi. Các dòng bắt đầu bằng // sẽ được bỏ qua.</w:t>
+        <w:t xml:space="preserve">// HUONG DAN: Gach chan tu de tao o dien khuyet co dinh. Dat tu trong "dau nhay kep" de tao o hoan doi. Gach chan dong lua chon dung (MC/TF). Cac dong bat dau bang // se duoc bo qua. Khong dung dau + va dau *.</w:t>
       </w:r>
     </w:p>
     <w:p>
@@ -45,57 +45,83 @@
     </w:p>
     <w:p>
       <w:r>
-        <w:t xml:space="preserve"># ADN có cấu trúc không gian dạng gì?</w:t>
-      </w:r>
-    </w:p>
-    <w:p>
-      <w:r>
-        <w:t xml:space="preserve">+ *Xoắn kép</w:t>
-      </w:r>
-    </w:p>
-    <w:p>
-      <w:r>
-        <w:t xml:space="preserve">+ Mạch thẳng</w:t>
-      </w:r>
-    </w:p>
-    <w:p>
-      <w:r>
-        <w:t xml:space="preserve">+ Vòng tròn</w:t>
-      </w:r>
-    </w:p>
-    <w:p>
-      <w:r>
-        <w:t xml:space="preserve">+ Xoắn ba</w:t>
-      </w:r>
-    </w:p>
-    <w:p>
-      <w:r>
-        <w:t xml:space="preserve">## Chọn đúng/sai cho các phát biểu sau về ADN:</w:t>
-      </w:r>
-    </w:p>
-    <w:p>
-      <w:r>
-        <w:t xml:space="preserve">+ a) ADN có cấu trúc gồm hai mạch = Đúng</w:t>
-      </w:r>
-    </w:p>
-    <w:p>
-      <w:r>
-        <w:t xml:space="preserve">+ b) Đơn phân của ADN là axit amin = Sai</w:t>
-      </w:r>
-    </w:p>
-    <w:p>
-      <w:r>
-        <w:t xml:space="preserve">+ c) ADN có trong nhân tế bào = Đúng</w:t>
-      </w:r>
-    </w:p>
-    <w:p>
-      <w:r>
-        <w:t xml:space="preserve">+ d) ADN chỉ có một mạch đơn = Sai</w:t>
-      </w:r>
-    </w:p>
-    <w:p>
-      <w:r>
-        <w:t xml:space="preserve">### Đơn phân của ADN được gọi là gì? = nucleotide</w:t>
+        <w:t xml:space="preserve">#</w:t>
+      </w:r>
+    </w:p>
+    <w:p>
+      <w:r>
+        <w:t xml:space="preserve">cau: ADN có cấu trúc không gian dạng gì?</w:t>
+      </w:r>
+    </w:p>
+    <w:p>
+      <w:r>
+        <w:t xml:space="preserve">A. Mạch thẳng</w:t>
+      </w:r>
+    </w:p>
+    <w:p>
+      <w:r>
+        <w:rPr>
+          <w:u w:val="single"/>
+        </w:rPr>
+        <w:t xml:space="preserve">B. Xoắn kép</w:t>
+      </w:r>
+    </w:p>
+    <w:p>
+      <w:r>
+        <w:t xml:space="preserve">C. Vòng tròn</w:t>
+      </w:r>
+    </w:p>
+    <w:p>
+      <w:r>
+        <w:t xml:space="preserve">D. Xoắn ba</w:t>
+      </w:r>
+    </w:p>
+    <w:p>
+      <w:r>
+        <w:t xml:space="preserve">##</w:t>
+      </w:r>
+    </w:p>
+    <w:p>
+      <w:r>
+        <w:t xml:space="preserve">cau: Chọn đúng/sai về ADN:</w:t>
+      </w:r>
+    </w:p>
+    <w:p>
+      <w:r>
+        <w:t xml:space="preserve">a. ADN có hai mạch</w:t>
+      </w:r>
+    </w:p>
+    <w:p>
+      <w:r>
+        <w:rPr>
+          <w:u w:val="single"/>
+        </w:rPr>
+        <w:t xml:space="preserve">b. Đơn phân của ADN là nucleotide</w:t>
+      </w:r>
+    </w:p>
+    <w:p>
+      <w:r>
+        <w:t xml:space="preserve">c. ADN chỉ có một mạch đơn</w:t>
+      </w:r>
+    </w:p>
+    <w:p>
+      <w:r>
+        <w:t xml:space="preserve">d. ADN không có trong nhân</w:t>
+      </w:r>
+    </w:p>
+    <w:p>
+      <w:r>
+        <w:t xml:space="preserve">###</w:t>
+      </w:r>
+    </w:p>
+    <w:p>
+      <w:r>
+        <w:t xml:space="preserve">cau: Đơn phân của ADN được gọi là gì?</w:t>
+      </w:r>
+    </w:p>
+    <w:p>
+      <w:r>
+        <w:t xml:space="preserve">dap an: nucleotide</w:t>
       </w:r>
     </w:p>
     <w:p>
@@ -131,10 +157,6 @@
 </w:document>
 </file>
 
-<file path=word/comments.xml><?xml version="1.0" encoding="utf-8"?>
-<w:comments xmlns:cx="http://schemas.microsoft.com/office/drawing/2014/chartex" xmlns:cx1="http://schemas.microsoft.com/office/drawing/2015/9/8/chartex" xmlns:cx2="http://schemas.microsoft.com/office/drawing/2015/10/21/chartex" xmlns:cx3="http://schemas.microsoft.com/office/drawing/2016/5/9/chartex" xmlns:cx4="http://schemas.microsoft.com/office/drawing/2016/5/10/chartex" xmlns:cx5="http://schemas.microsoft.com/office/drawing/2016/5/11/chartex" xmlns:cx6="http://schemas.microsoft.com/office/drawing/2016/5/12/chartex" xmlns:cx7="http://schemas.microsoft.com/office/drawing/2016/5/13/chartex" xmlns:cx8="http://schemas.microsoft.com/office/drawing/2016/5/14/chartex" xmlns:mc="http://schemas.openxmlformats.org/markup-compatibility/2006" xmlns:aink="http://schemas.microsoft.com/office/drawing/2016/ink" xmlns:am3d="http://schemas.microsoft.com/office/drawing/2017/model3d" xmlns:o="urn:schemas-microsoft-com:office:office" xmlns:r="http://schemas.openxmlformats.org/officeDocument/2006/relationships" xmlns:m="http://schemas.openxmlformats.org/officeDocument/2006/math" xmlns:v="urn:schemas-microsoft-com:vml" xmlns:wp14="http://schemas.microsoft.com/office/word/2010/wordprocessingDrawing" xmlns:wp="http://schemas.openxmlformats.org/drawingml/2006/wordprocessingDrawing" xmlns:w10="urn:schemas-microsoft-com:office:word" xmlns:w="http://schemas.openxmlformats.org/wordprocessingml/2006/main" xmlns:w14="http://schemas.microsoft.com/office/word/2010/wordml" xmlns:w15="http://schemas.microsoft.com/office/word/2012/wordml" xmlns:w16cex="http://schemas.microsoft.com/office/word/2018/wordml/cex" xmlns:w16cid="http://schemas.microsoft.com/office/word/2016/wordml/cid" xmlns:w16="http://schemas.microsoft.com/office/word/2018/wordml" xmlns:w16sdtdh="http://schemas.microsoft.com/office/word/2020/wordml/sdtdatahash" xmlns:w16se="http://schemas.microsoft.com/office/word/2015/wordml/symex" xmlns:wpg="http://schemas.microsoft.com/office/word/2010/wordprocessingGroup" xmlns:wpi="http://schemas.microsoft.com/office/word/2010/wordprocessingInk" xmlns:wne="http://schemas.microsoft.com/office/word/2006/wordml" xmlns:wps="http://schemas.microsoft.com/office/word/2010/wordprocessingShape"/>
-</file>
-
 <file path=word/endnotes.xml><?xml version="1.0" encoding="utf-8"?>
 <w:endnotes xmlns:wpc="http://schemas.microsoft.com/office/word/2010/wordprocessingCanvas" xmlns:mc="http://schemas.openxmlformats.org/markup-compatibility/2006" xmlns:o="urn:schemas-microsoft-com:office:office" xmlns:r="http://schemas.openxmlformats.org/officeDocument/2006/relationships" xmlns:m="http://schemas.openxmlformats.org/officeDocument/2006/math" xmlns:v="urn:schemas-microsoft-com:vml" xmlns:wp14="http://schemas.microsoft.com/office/word/2010/wordprocessingDrawing" xmlns:wp="http://schemas.openxmlformats.org/drawingml/2006/wordprocessingDrawing" xmlns:w10="urn:schemas-microsoft-com:office:word" xmlns:w="http://schemas.openxmlformats.org/wordprocessingml/2006/main" xmlns:w14="http://schemas.microsoft.com/office/word/2010/wordml" xmlns:w15="http://schemas.microsoft.com/office/word/2012/wordml" xmlns:wpg="http://schemas.microsoft.com/office/word/2010/wordprocessingGroup" xmlns:wpi="http://schemas.microsoft.com/office/word/2010/wordprocessingInk" xmlns:wne="http://schemas.microsoft.com/office/word/2006/wordml" xmlns:wps="http://schemas.microsoft.com/office/word/2010/wordprocessingShape" mc:Ignorable="w14 w15 wp14">
   <w:endnote w:type="separator" w:id="-1">
@@ -213,7 +235,7 @@
 <w:numbering xmlns:wpc="http://schemas.microsoft.com/office/word/2010/wordprocessingCanvas" xmlns:mc="http://schemas.openxmlformats.org/markup-compatibility/2006" xmlns:o="urn:schemas-microsoft-com:office:office" xmlns:r="http://schemas.openxmlformats.org/officeDocument/2006/relationships" xmlns:m="http://schemas.openxmlformats.org/officeDocument/2006/math" xmlns:v="urn:schemas-microsoft-com:vml" xmlns:wp14="http://schemas.microsoft.com/office/word/2010/wordprocessingDrawing" xmlns:wp="http://schemas.openxmlformats.org/drawingml/2006/wordprocessingDrawing" xmlns:w10="urn:schemas-microsoft-com:office:word" xmlns:w="http://schemas.openxmlformats.org/wordprocessingml/2006/main" xmlns:w14="http://schemas.microsoft.com/office/word/2010/wordml" xmlns:w15="http://schemas.microsoft.com/office/word/2012/wordml" xmlns:wpg="http://schemas.microsoft.com/office/word/2010/wordprocessingGroup" xmlns:wpi="http://schemas.microsoft.com/office/word/2010/wordprocessingInk" xmlns:wne="http://schemas.microsoft.com/office/word/2006/wordml" xmlns:wps="http://schemas.microsoft.com/office/word/2010/wordprocessingShape" mc:Ignorable="w14 w15 wp14">
   <w:abstractNum w:abstractNumId="1" w15:restartNumberingAfterBreak="0">
     <w:multiLevelType w:val="hybridMultilevel"/>
-    <w:lvl w:ilvl="0" w15:tentative="1">
+    <w:lvl w:ilvl="0" w:tentative="1">
       <w:start w:val="1"/>
       <w:numFmt w:val="bullet"/>
       <w:lvlText w:val="●"/>
@@ -222,7 +244,7 @@
         <w:ind w:left="720" w:hanging="360"/>
       </w:pPr>
     </w:lvl>
-    <w:lvl w:ilvl="1" w15:tentative="1">
+    <w:lvl w:ilvl="1" w:tentative="1">
       <w:start w:val="1"/>
       <w:numFmt w:val="bullet"/>
       <w:lvlText w:val="○"/>
@@ -231,7 +253,7 @@
         <w:ind w:left="1440" w:hanging="360"/>
       </w:pPr>
     </w:lvl>
-    <w:lvl w:ilvl="2" w15:tentative="1">
+    <w:lvl w:ilvl="2" w:tentative="1">
       <w:start w:val="1"/>
       <w:numFmt w:val="bullet"/>
       <w:lvlText w:val="■"/>
@@ -240,7 +262,7 @@
         <w:ind w:left="2160" w:hanging="360"/>
       </w:pPr>
     </w:lvl>
-    <w:lvl w:ilvl="3" w15:tentative="1">
+    <w:lvl w:ilvl="3" w:tentative="1">
       <w:start w:val="1"/>
       <w:numFmt w:val="bullet"/>
       <w:lvlText w:val="●"/>
@@ -249,7 +271,7 @@
         <w:ind w:left="2880" w:hanging="360"/>
       </w:pPr>
     </w:lvl>
-    <w:lvl w:ilvl="4" w15:tentative="1">
+    <w:lvl w:ilvl="4" w:tentative="1">
       <w:start w:val="1"/>
       <w:numFmt w:val="bullet"/>
       <w:lvlText w:val="○"/>
@@ -258,7 +280,7 @@
         <w:ind w:left="3600" w:hanging="360"/>
       </w:pPr>
     </w:lvl>
-    <w:lvl w:ilvl="5" w15:tentative="1">
+    <w:lvl w:ilvl="5" w:tentative="1">
       <w:start w:val="1"/>
       <w:numFmt w:val="bullet"/>
       <w:lvlText w:val="■"/>
@@ -267,7 +289,7 @@
         <w:ind w:left="4320" w:hanging="360"/>
       </w:pPr>
     </w:lvl>
-    <w:lvl w:ilvl="6" w15:tentative="1">
+    <w:lvl w:ilvl="6" w:tentative="1">
       <w:start w:val="1"/>
       <w:numFmt w:val="bullet"/>
       <w:lvlText w:val="●"/>
@@ -276,7 +298,7 @@
         <w:ind w:left="5040" w:hanging="360"/>
       </w:pPr>
     </w:lvl>
-    <w:lvl w:ilvl="7" w15:tentative="1">
+    <w:lvl w:ilvl="7" w:tentative="1">
       <w:start w:val="1"/>
       <w:numFmt w:val="bullet"/>
       <w:lvlText w:val="●"/>
@@ -285,7 +307,7 @@
         <w:ind w:left="5760" w:hanging="360"/>
       </w:pPr>
     </w:lvl>
-    <w:lvl w:ilvl="8" w15:tentative="1">
+    <w:lvl w:ilvl="8" w:tentative="1">
       <w:start w:val="1"/>
       <w:numFmt w:val="bullet"/>
       <w:lvlText w:val="●"/>
@@ -310,6 +332,10 @@
     <w:rPrDefault/>
     <w:pPrDefault/>
   </w:docDefaults>
+  <w:style w:type="paragraph" w:styleId="Normal" w:default="1">
+    <w:name w:val="Normal"/>
+    <w:qFormat/>
+  </w:style>
   <w:style w:type="paragraph" w:styleId="Title">
     <w:name w:val="Title"/>
     <w:basedOn w:val="Normal"/>
@@ -482,4 +508,294 @@
     </w:rPr>
   </w:style>
 </w:styles>
+</file>
+
+<file path=word/theme/theme1.xml><?xml version="1.0" encoding="utf-8"?>
+<a:theme xmlns:a="http://schemas.openxmlformats.org/drawingml/2006/main" name="Office Theme">
+  <a:themeElements>
+    <a:clrScheme name="Office">
+      <a:dk1>
+        <a:sysClr val="windowText" lastClr="000000"/>
+      </a:dk1>
+      <a:lt1>
+        <a:sysClr val="window" lastClr="FFFFFF"/>
+      </a:lt1>
+      <a:dk2>
+        <a:srgbClr val="44546A"/>
+      </a:dk2>
+      <a:lt2>
+        <a:srgbClr val="E7E6E6"/>
+      </a:lt2>
+      <a:accent1>
+        <a:srgbClr val="4472C4"/>
+      </a:accent1>
+      <a:accent2>
+        <a:srgbClr val="ED7D31"/>
+      </a:accent2>
+      <a:accent3>
+        <a:srgbClr val="A5A5A5"/>
+      </a:accent3>
+      <a:accent4>
+        <a:srgbClr val="FFC000"/>
+      </a:accent4>
+      <a:accent5>
+        <a:srgbClr val="5B9BD5"/>
+      </a:accent5>
+      <a:accent6>
+        <a:srgbClr val="70AD47"/>
+      </a:accent6>
+      <a:hlink>
+        <a:srgbClr val="0563C1"/>
+      </a:hlink>
+      <a:folHlink>
+        <a:srgbClr val="954F72"/>
+      </a:folHlink>
+    </a:clrScheme>
+    <a:fontScheme name="Office">
+      <a:majorFont>
+        <a:latin typeface="Calibri Light" panose="020F0302020204030204"/>
+        <a:ea typeface=""/>
+        <a:cs typeface=""/>
+        <a:font script="Jpan" typeface="游ゴシック Light"/>
+        <a:font script="Hang" typeface="맑은 고딕"/>
+        <a:font script="Hans" typeface="等线 Light"/>
+        <a:font script="Hant" typeface="新細明體"/>
+        <a:font script="Arab" typeface="Times New Roman"/>
+        <a:font script="Hebr" typeface="Times New Roman"/>
+        <a:font script="Thai" typeface="Angsana New"/>
+        <a:font script="Ethi" typeface="Nyala"/>
+        <a:font script="Beng" typeface="Vrinda"/>
+        <a:font script="Gujr" typeface="Shruti"/>
+        <a:font script="Khmr" typeface="MoolBoran"/>
+        <a:font script="Knda" typeface="Tunga"/>
+        <a:font script="Guru" typeface="Raavi"/>
+        <a:font script="Cans" typeface="Euphemia"/>
+        <a:font script="Cher" typeface="Plantagenet Cherokee"/>
+        <a:font script="Yiii" typeface="Microsoft Yi Baiti"/>
+        <a:font script="Tibt" typeface="Microsoft Himalaya"/>
+        <a:font script="Thaa" typeface="MV Boli"/>
+        <a:font script="Deva" typeface="Mangal"/>
+        <a:font script="Telu" typeface="Gautami"/>
+        <a:font script="Taml" typeface="Latha"/>
+        <a:font script="Syrc" typeface="Estrangelo Edessa"/>
+        <a:font script="Orya" typeface="Kalinga"/>
+        <a:font script="Mlym" typeface="Kartika"/>
+        <a:font script="Laoo" typeface="DokChampa"/>
+        <a:font script="Sinh" typeface="Iskoola Pota"/>
+        <a:font script="Mong" typeface="Mongolian Baiti"/>
+        <a:font script="Viet" typeface="Times New Roman"/>
+        <a:font script="Uigh" typeface="Microsoft Uighur"/>
+        <a:font script="Geor" typeface="Sylfaen"/>
+        <a:font script="Armn" typeface="Arial"/>
+        <a:font script="Bugi" typeface="Leelawadee UI"/>
+        <a:font script="Bopo" typeface="Microsoft JhengHei"/>
+        <a:font script="Java" typeface="Javanese Text"/>
+        <a:font script="Lisu" typeface="Segoe UI"/>
+        <a:font script="Mymr" typeface="Myanmar Text"/>
+        <a:font script="Nkoo" typeface="Ebrima"/>
+        <a:font script="Olck" typeface="Nirmala UI"/>
+        <a:font script="Osma" typeface="Ebrima"/>
+        <a:font script="Phag" typeface="Phagspa"/>
+        <a:font script="Syrn" typeface="Estrangelo Edessa"/>
+        <a:font script="Syrj" typeface="Estrangelo Edessa"/>
+        <a:font script="Syre" typeface="Estrangelo Edessa"/>
+        <a:font script="Sora" typeface="Nirmala UI"/>
+        <a:font script="Tale" typeface="Microsoft Tai Le"/>
+        <a:font script="Talu" typeface="Microsoft New Tai Lue"/>
+        <a:font script="Tfng" typeface="Ebrima"/>
+      </a:majorFont>
+      <a:minorFont>
+        <a:latin typeface="Calibri" panose="020F0502020204030204"/>
+        <a:ea typeface=""/>
+        <a:cs typeface=""/>
+        <a:font script="Jpan" typeface="游明朝"/>
+        <a:font script="Hang" typeface="맑은 고딕"/>
+        <a:font script="Hans" typeface="等线"/>
+        <a:font script="Hant" typeface="新細明體"/>
+        <a:font script="Arab" typeface="Arial"/>
+        <a:font script="Hebr" typeface="Arial"/>
+        <a:font script="Thai" typeface="Cordia New"/>
+        <a:font script="Ethi" typeface="Nyala"/>
+        <a:font script="Beng" typeface="Vrinda"/>
+        <a:font script="Gujr" typeface="Shruti"/>
+        <a:font script="Khmr" typeface="DaunPenh"/>
+        <a:font script="Knda" typeface="Tunga"/>
+        <a:font script="Guru" typeface="Raavi"/>
+        <a:font script="Cans" typeface="Euphemia"/>
+        <a:font script="Cher" typeface="Plantagenet Cherokee"/>
+        <a:font script="Yiii" typeface="Microsoft Yi Baiti"/>
+        <a:font script="Tibt" typeface="Microsoft Himalaya"/>
+        <a:font script="Thaa" typeface="MV Boli"/>
+        <a:font script="Deva" typeface="Mangal"/>
+        <a:font script="Telu" typeface="Gautami"/>
+        <a:font script="Taml" typeface="Latha"/>
+        <a:font script="Syrc" typeface="Estrangelo Edessa"/>
+        <a:font script="Orya" typeface="Kalinga"/>
+        <a:font script="Mlym" typeface="Kartika"/>
+        <a:font script="Laoo" typeface="DokChampa"/>
+        <a:font script="Sinh" typeface="Iskoola Pota"/>
+        <a:font script="Mong" typeface="Mongolian Baiti"/>
+        <a:font script="Viet" typeface="Arial"/>
+        <a:font script="Uigh" typeface="Microsoft Uighur"/>
+        <a:font script="Geor" typeface="Sylfaen"/>
+        <a:font script="Armn" typeface="Arial"/>
+        <a:font script="Bugi" typeface="Leelawadee UI"/>
+        <a:font script="Bopo" typeface="Microsoft JhengHei"/>
+        <a:font script="Java" typeface="Javanese Text"/>
+        <a:font script="Lisu" typeface="Segoe UI"/>
+        <a:font script="Mymr" typeface="Myanmar Text"/>
+        <a:font script="Nkoo" typeface="Ebrima"/>
+        <a:font script="Olck" typeface="Nirmala UI"/>
+        <a:font script="Osma" typeface="Ebrima"/>
+        <a:font script="Phag" typeface="Phagspa"/>
+        <a:font script="Syrn" typeface="Estrangelo Edessa"/>
+        <a:font script="Syrj" typeface="Estrangelo Edessa"/>
+        <a:font script="Syre" typeface="Estrangelo Edessa"/>
+        <a:font script="Sora" typeface="Nirmala UI"/>
+        <a:font script="Tale" typeface="Microsoft Tai Le"/>
+        <a:font script="Talu" typeface="Microsoft New Tai Lue"/>
+        <a:font script="Tfng" typeface="Ebrima"/>
+      </a:minorFont>
+    </a:fontScheme>
+    <a:fmtScheme name="Office">
+      <a:fillStyleLst>
+        <a:solidFill>
+          <a:schemeClr val="phClr"/>
+        </a:solidFill>
+        <a:gradFill rotWithShape="true">
+          <a:gsLst>
+            <a:gs pos="0">
+              <a:schemeClr val="phClr">
+                <a:lumMod val="110000"/>
+                <a:satMod val="105000"/>
+                <a:tint val="67000"/>
+              </a:schemeClr>
+            </a:gs>
+            <a:gs pos="50000">
+              <a:schemeClr val="phClr">
+                <a:lumMod val="105000"/>
+                <a:satMod val="103000"/>
+                <a:tint val="73000"/>
+              </a:schemeClr>
+            </a:gs>
+            <a:gs pos="100000">
+              <a:schemeClr val="phClr">
+                <a:lumMod val="105000"/>
+                <a:satMod val="109000"/>
+                <a:tint val="81000"/>
+              </a:schemeClr>
+            </a:gs>
+          </a:gsLst>
+          <a:lin ang="5400000" scaled="false"/>
+        </a:gradFill>
+        <a:gradFill rotWithShape="true">
+          <a:gsLst>
+            <a:gs pos="0">
+              <a:schemeClr val="phClr">
+                <a:satMod val="103000"/>
+                <a:lumMod val="102000"/>
+                <a:tint val="94000"/>
+              </a:schemeClr>
+            </a:gs>
+            <a:gs pos="50000">
+              <a:schemeClr val="phClr">
+                <a:satMod val="110000"/>
+                <a:lumMod val="100000"/>
+                <a:shade val="100000"/>
+              </a:schemeClr>
+            </a:gs>
+            <a:gs pos="100000">
+              <a:schemeClr val="phClr">
+                <a:lumMod val="99000"/>
+                <a:satMod val="120000"/>
+                <a:shade val="78000"/>
+              </a:schemeClr>
+            </a:gs>
+          </a:gsLst>
+          <a:lin ang="5400000" scaled="false"/>
+        </a:gradFill>
+      </a:fillStyleLst>
+      <a:lnStyleLst>
+        <a:ln w="6350" cap="flat" cmpd="sng" algn="ctr">
+          <a:solidFill>
+            <a:schemeClr val="phClr"/>
+          </a:solidFill>
+          <a:prstDash val="solid"/>
+          <a:miter lim="800000"/>
+        </a:ln>
+        <a:ln w="12700" cap="flat" cmpd="sng" algn="ctr">
+          <a:solidFill>
+            <a:schemeClr val="phClr"/>
+          </a:solidFill>
+          <a:prstDash val="solid"/>
+          <a:miter lim="800000"/>
+        </a:ln>
+        <a:ln w="19050" cap="flat" cmpd="sng" algn="ctr">
+          <a:solidFill>
+            <a:schemeClr val="phClr"/>
+          </a:solidFill>
+          <a:prstDash val="solid"/>
+          <a:miter lim="800000"/>
+        </a:ln>
+      </a:lnStyleLst>
+      <a:effectStyleLst>
+        <a:effectStyle>
+          <a:effectLst/>
+        </a:effectStyle>
+        <a:effectStyle>
+          <a:effectLst/>
+        </a:effectStyle>
+        <a:effectStyle>
+          <a:effectLst>
+            <a:outerShdw blurRad="57150" dist="19050" dir="5400000" algn="ctr" rotWithShape="false">
+              <a:srgbClr val="000000">
+                <a:alpha val="63000"/>
+              </a:srgbClr>
+            </a:outerShdw>
+          </a:effectLst>
+        </a:effectStyle>
+      </a:effectStyleLst>
+      <a:bgFillStyleLst>
+        <a:solidFill>
+          <a:schemeClr val="phClr"/>
+        </a:solidFill>
+        <a:solidFill>
+          <a:schemeClr val="phClr">
+            <a:tint val="95000"/>
+            <a:satMod val="170000"/>
+          </a:schemeClr>
+        </a:solidFill>
+        <a:gradFill rotWithShape="true">
+          <a:gsLst>
+            <a:gs pos="0">
+              <a:schemeClr val="phClr">
+                <a:tint val="93000"/>
+                <a:satMod val="150000"/>
+                <a:shade val="98000"/>
+                <a:lumMod val="102000"/>
+              </a:schemeClr>
+            </a:gs>
+            <a:gs pos="50000">
+              <a:schemeClr val="phClr">
+                <a:tint val="98000"/>
+                <a:satMod val="130000"/>
+                <a:shade val="90000"/>
+                <a:lumMod val="103000"/>
+              </a:schemeClr>
+            </a:gs>
+            <a:gs pos="100000">
+              <a:schemeClr val="phClr">
+                <a:shade val="63000"/>
+                <a:satMod val="120000"/>
+              </a:schemeClr>
+            </a:gs>
+          </a:gsLst>
+          <a:lin ang="5400000" scaled="false"/>
+        </a:gradFill>
+      </a:bgFillStyleLst>
+    </a:fmtScheme>
+  </a:themeElements>
+  <a:objectDefaults/>
+  <a:extraClrSchemeLst/>
+</a:theme>
 </file>
</xml_diff>

<commit_message>
fix: dot 2 - BUG-01..13,15 theo spec + next 16.4.1 (FIX-2026-10-21)
</commit_message>
<xml_diff>
--- a/public/templates/mau-cau-hoi.docx
+++ b/public/templates/mau-cau-hoi.docx
@@ -7,7 +7,7 @@
         <w:pStyle w:val="Heading3"/>
       </w:pPr>
       <w:r>
-        <w:t xml:space="preserve">// HUONG DAN: Gach chan tu de tao o dien khuyet co dinh. Dat tu trong "dau nhay kep" de tao o hoan doi. Gach chan dong lua chon dung (MC/TF). Cac dong bat dau bang // se duoc bo qua. Khong dung dau + va dau *.</w:t>
+        <w:t xml:space="preserve">// HUONG DAN: Gach chan tu de tao o dien khuyet co dinh. Gach chan kem ngoac kep (viet __"tu"__) de tao o hoan doi; ngoac kep thuong mot minh KHONG tao o trong. Gach chan dong lua chon dung (MC/TF). Cac dong bat dau bang // se duoc bo qua. Khong dung dau + va dau *.</w:t>
       </w:r>
     </w:p>
     <w:p>
@@ -129,18 +129,27 @@
         <w:t xml:space="preserve">- Hai mạch của ADN liên kết theo nguyên tắc </w:t>
       </w:r>
       <w:r>
+        <w:rPr>
+          <w:u w:val="single"/>
+        </w:rPr>
         <w:t xml:space="preserve">"bổ sung"</w:t>
       </w:r>
       <w:r>
         <w:t xml:space="preserve">, trong đó A liên kết với </w:t>
       </w:r>
       <w:r>
+        <w:rPr>
+          <w:u w:val="single"/>
+        </w:rPr>
         <w:t xml:space="preserve">"T"</w:t>
       </w:r>
       <w:r>
         <w:t xml:space="preserve"> và G liên kết với </w:t>
       </w:r>
       <w:r>
+        <w:rPr>
+          <w:u w:val="single"/>
+        </w:rPr>
         <w:t xml:space="preserve">"X"</w:t>
       </w:r>
       <w:r>
@@ -157,6 +166,10 @@
 </w:document>
 </file>
 
+<file path=word/comments.xml><?xml version="1.0" encoding="utf-8"?>
+<w:comments xmlns:cx="http://schemas.microsoft.com/office/drawing/2014/chartex" xmlns:cx1="http://schemas.microsoft.com/office/drawing/2015/9/8/chartex" xmlns:cx2="http://schemas.microsoft.com/office/drawing/2015/10/21/chartex" xmlns:cx3="http://schemas.microsoft.com/office/drawing/2016/5/9/chartex" xmlns:cx4="http://schemas.microsoft.com/office/drawing/2016/5/10/chartex" xmlns:cx5="http://schemas.microsoft.com/office/drawing/2016/5/11/chartex" xmlns:cx6="http://schemas.microsoft.com/office/drawing/2016/5/12/chartex" xmlns:cx7="http://schemas.microsoft.com/office/drawing/2016/5/13/chartex" xmlns:cx8="http://schemas.microsoft.com/office/drawing/2016/5/14/chartex" xmlns:mc="http://schemas.openxmlformats.org/markup-compatibility/2006" xmlns:aink="http://schemas.microsoft.com/office/drawing/2016/ink" xmlns:am3d="http://schemas.microsoft.com/office/drawing/2017/model3d" xmlns:o="urn:schemas-microsoft-com:office:office" xmlns:r="http://schemas.openxmlformats.org/officeDocument/2006/relationships" xmlns:m="http://schemas.openxmlformats.org/officeDocument/2006/math" xmlns:v="urn:schemas-microsoft-com:vml" xmlns:wp14="http://schemas.microsoft.com/office/word/2010/wordprocessingDrawing" xmlns:wp="http://schemas.openxmlformats.org/drawingml/2006/wordprocessingDrawing" xmlns:w10="urn:schemas-microsoft-com:office:word" xmlns:w="http://schemas.openxmlformats.org/wordprocessingml/2006/main" xmlns:w14="http://schemas.microsoft.com/office/word/2010/wordml" xmlns:w15="http://schemas.microsoft.com/office/word/2012/wordml" xmlns:w16cex="http://schemas.microsoft.com/office/word/2018/wordml/cex" xmlns:w16cid="http://schemas.microsoft.com/office/word/2016/wordml/cid" xmlns:w16="http://schemas.microsoft.com/office/word/2018/wordml" xmlns:w16sdtdh="http://schemas.microsoft.com/office/word/2020/wordml/sdtdatahash" xmlns:w16se="http://schemas.microsoft.com/office/word/2015/wordml/symex" xmlns:wpg="http://schemas.microsoft.com/office/word/2010/wordprocessingGroup" xmlns:wpi="http://schemas.microsoft.com/office/word/2010/wordprocessingInk" xmlns:wne="http://schemas.microsoft.com/office/word/2006/wordml" xmlns:wps="http://schemas.microsoft.com/office/word/2010/wordprocessingShape"/>
+</file>
+
 <file path=word/endnotes.xml><?xml version="1.0" encoding="utf-8"?>
 <w:endnotes xmlns:wpc="http://schemas.microsoft.com/office/word/2010/wordprocessingCanvas" xmlns:mc="http://schemas.openxmlformats.org/markup-compatibility/2006" xmlns:o="urn:schemas-microsoft-com:office:office" xmlns:r="http://schemas.openxmlformats.org/officeDocument/2006/relationships" xmlns:m="http://schemas.openxmlformats.org/officeDocument/2006/math" xmlns:v="urn:schemas-microsoft-com:vml" xmlns:wp14="http://schemas.microsoft.com/office/word/2010/wordprocessingDrawing" xmlns:wp="http://schemas.openxmlformats.org/drawingml/2006/wordprocessingDrawing" xmlns:w10="urn:schemas-microsoft-com:office:word" xmlns:w="http://schemas.openxmlformats.org/wordprocessingml/2006/main" xmlns:w14="http://schemas.microsoft.com/office/word/2010/wordml" xmlns:w15="http://schemas.microsoft.com/office/word/2012/wordml" xmlns:wpg="http://schemas.microsoft.com/office/word/2010/wordprocessingGroup" xmlns:wpi="http://schemas.microsoft.com/office/word/2010/wordprocessingInk" xmlns:wne="http://schemas.microsoft.com/office/word/2006/wordml" xmlns:wps="http://schemas.microsoft.com/office/word/2010/wordprocessingShape" mc:Ignorable="w14 w15 wp14">
   <w:endnote w:type="separator" w:id="-1">
@@ -235,7 +248,7 @@
 <w:numbering xmlns:wpc="http://schemas.microsoft.com/office/word/2010/wordprocessingCanvas" xmlns:mc="http://schemas.openxmlformats.org/markup-compatibility/2006" xmlns:o="urn:schemas-microsoft-com:office:office" xmlns:r="http://schemas.openxmlformats.org/officeDocument/2006/relationships" xmlns:m="http://schemas.openxmlformats.org/officeDocument/2006/math" xmlns:v="urn:schemas-microsoft-com:vml" xmlns:wp14="http://schemas.microsoft.com/office/word/2010/wordprocessingDrawing" xmlns:wp="http://schemas.openxmlformats.org/drawingml/2006/wordprocessingDrawing" xmlns:w10="urn:schemas-microsoft-com:office:word" xmlns:w="http://schemas.openxmlformats.org/wordprocessingml/2006/main" xmlns:w14="http://schemas.microsoft.com/office/word/2010/wordml" xmlns:w15="http://schemas.microsoft.com/office/word/2012/wordml" xmlns:wpg="http://schemas.microsoft.com/office/word/2010/wordprocessingGroup" xmlns:wpi="http://schemas.microsoft.com/office/word/2010/wordprocessingInk" xmlns:wne="http://schemas.microsoft.com/office/word/2006/wordml" xmlns:wps="http://schemas.microsoft.com/office/word/2010/wordprocessingShape" mc:Ignorable="w14 w15 wp14">
   <w:abstractNum w:abstractNumId="1" w15:restartNumberingAfterBreak="0">
     <w:multiLevelType w:val="hybridMultilevel"/>
-    <w:lvl w:ilvl="0" w:tentative="1">
+    <w:lvl w:ilvl="0" w15:tentative="1">
       <w:start w:val="1"/>
       <w:numFmt w:val="bullet"/>
       <w:lvlText w:val="●"/>
@@ -244,7 +257,7 @@
         <w:ind w:left="720" w:hanging="360"/>
       </w:pPr>
     </w:lvl>
-    <w:lvl w:ilvl="1" w:tentative="1">
+    <w:lvl w:ilvl="1" w15:tentative="1">
       <w:start w:val="1"/>
       <w:numFmt w:val="bullet"/>
       <w:lvlText w:val="○"/>
@@ -253,7 +266,7 @@
         <w:ind w:left="1440" w:hanging="360"/>
       </w:pPr>
     </w:lvl>
-    <w:lvl w:ilvl="2" w:tentative="1">
+    <w:lvl w:ilvl="2" w15:tentative="1">
       <w:start w:val="1"/>
       <w:numFmt w:val="bullet"/>
       <w:lvlText w:val="■"/>
@@ -262,7 +275,7 @@
         <w:ind w:left="2160" w:hanging="360"/>
       </w:pPr>
     </w:lvl>
-    <w:lvl w:ilvl="3" w:tentative="1">
+    <w:lvl w:ilvl="3" w15:tentative="1">
       <w:start w:val="1"/>
       <w:numFmt w:val="bullet"/>
       <w:lvlText w:val="●"/>
@@ -271,7 +284,7 @@
         <w:ind w:left="2880" w:hanging="360"/>
       </w:pPr>
     </w:lvl>
-    <w:lvl w:ilvl="4" w:tentative="1">
+    <w:lvl w:ilvl="4" w15:tentative="1">
       <w:start w:val="1"/>
       <w:numFmt w:val="bullet"/>
       <w:lvlText w:val="○"/>
@@ -280,7 +293,7 @@
         <w:ind w:left="3600" w:hanging="360"/>
       </w:pPr>
     </w:lvl>
-    <w:lvl w:ilvl="5" w:tentative="1">
+    <w:lvl w:ilvl="5" w15:tentative="1">
       <w:start w:val="1"/>
       <w:numFmt w:val="bullet"/>
       <w:lvlText w:val="■"/>
@@ -289,7 +302,7 @@
         <w:ind w:left="4320" w:hanging="360"/>
       </w:pPr>
     </w:lvl>
-    <w:lvl w:ilvl="6" w:tentative="1">
+    <w:lvl w:ilvl="6" w15:tentative="1">
       <w:start w:val="1"/>
       <w:numFmt w:val="bullet"/>
       <w:lvlText w:val="●"/>
@@ -298,7 +311,7 @@
         <w:ind w:left="5040" w:hanging="360"/>
       </w:pPr>
     </w:lvl>
-    <w:lvl w:ilvl="7" w:tentative="1">
+    <w:lvl w:ilvl="7" w15:tentative="1">
       <w:start w:val="1"/>
       <w:numFmt w:val="bullet"/>
       <w:lvlText w:val="●"/>
@@ -307,7 +320,7 @@
         <w:ind w:left="5760" w:hanging="360"/>
       </w:pPr>
     </w:lvl>
-    <w:lvl w:ilvl="8" w:tentative="1">
+    <w:lvl w:ilvl="8" w15:tentative="1">
       <w:start w:val="1"/>
       <w:numFmt w:val="bullet"/>
       <w:lvlText w:val="●"/>
@@ -332,10 +345,6 @@
     <w:rPrDefault/>
     <w:pPrDefault/>
   </w:docDefaults>
-  <w:style w:type="paragraph" w:styleId="Normal" w:default="1">
-    <w:name w:val="Normal"/>
-    <w:qFormat/>
-  </w:style>
   <w:style w:type="paragraph" w:styleId="Title">
     <w:name w:val="Title"/>
     <w:basedOn w:val="Normal"/>
@@ -508,294 +517,4 @@
     </w:rPr>
   </w:style>
 </w:styles>
-</file>
-
-<file path=word/theme/theme1.xml><?xml version="1.0" encoding="utf-8"?>
-<a:theme xmlns:a="http://schemas.openxmlformats.org/drawingml/2006/main" name="Office Theme">
-  <a:themeElements>
-    <a:clrScheme name="Office">
-      <a:dk1>
-        <a:sysClr val="windowText" lastClr="000000"/>
-      </a:dk1>
-      <a:lt1>
-        <a:sysClr val="window" lastClr="FFFFFF"/>
-      </a:lt1>
-      <a:dk2>
-        <a:srgbClr val="44546A"/>
-      </a:dk2>
-      <a:lt2>
-        <a:srgbClr val="E7E6E6"/>
-      </a:lt2>
-      <a:accent1>
-        <a:srgbClr val="4472C4"/>
-      </a:accent1>
-      <a:accent2>
-        <a:srgbClr val="ED7D31"/>
-      </a:accent2>
-      <a:accent3>
-        <a:srgbClr val="A5A5A5"/>
-      </a:accent3>
-      <a:accent4>
-        <a:srgbClr val="FFC000"/>
-      </a:accent4>
-      <a:accent5>
-        <a:srgbClr val="5B9BD5"/>
-      </a:accent5>
-      <a:accent6>
-        <a:srgbClr val="70AD47"/>
-      </a:accent6>
-      <a:hlink>
-        <a:srgbClr val="0563C1"/>
-      </a:hlink>
-      <a:folHlink>
-        <a:srgbClr val="954F72"/>
-      </a:folHlink>
-    </a:clrScheme>
-    <a:fontScheme name="Office">
-      <a:majorFont>
-        <a:latin typeface="Calibri Light" panose="020F0302020204030204"/>
-        <a:ea typeface=""/>
-        <a:cs typeface=""/>
-        <a:font script="Jpan" typeface="游ゴシック Light"/>
-        <a:font script="Hang" typeface="맑은 고딕"/>
-        <a:font script="Hans" typeface="等线 Light"/>
-        <a:font script="Hant" typeface="新細明體"/>
-        <a:font script="Arab" typeface="Times New Roman"/>
-        <a:font script="Hebr" typeface="Times New Roman"/>
-        <a:font script="Thai" typeface="Angsana New"/>
-        <a:font script="Ethi" typeface="Nyala"/>
-        <a:font script="Beng" typeface="Vrinda"/>
-        <a:font script="Gujr" typeface="Shruti"/>
-        <a:font script="Khmr" typeface="MoolBoran"/>
-        <a:font script="Knda" typeface="Tunga"/>
-        <a:font script="Guru" typeface="Raavi"/>
-        <a:font script="Cans" typeface="Euphemia"/>
-        <a:font script="Cher" typeface="Plantagenet Cherokee"/>
-        <a:font script="Yiii" typeface="Microsoft Yi Baiti"/>
-        <a:font script="Tibt" typeface="Microsoft Himalaya"/>
-        <a:font script="Thaa" typeface="MV Boli"/>
-        <a:font script="Deva" typeface="Mangal"/>
-        <a:font script="Telu" typeface="Gautami"/>
-        <a:font script="Taml" typeface="Latha"/>
-        <a:font script="Syrc" typeface="Estrangelo Edessa"/>
-        <a:font script="Orya" typeface="Kalinga"/>
-        <a:font script="Mlym" typeface="Kartika"/>
-        <a:font script="Laoo" typeface="DokChampa"/>
-        <a:font script="Sinh" typeface="Iskoola Pota"/>
-        <a:font script="Mong" typeface="Mongolian Baiti"/>
-        <a:font script="Viet" typeface="Times New Roman"/>
-        <a:font script="Uigh" typeface="Microsoft Uighur"/>
-        <a:font script="Geor" typeface="Sylfaen"/>
-        <a:font script="Armn" typeface="Arial"/>
-        <a:font script="Bugi" typeface="Leelawadee UI"/>
-        <a:font script="Bopo" typeface="Microsoft JhengHei"/>
-        <a:font script="Java" typeface="Javanese Text"/>
-        <a:font script="Lisu" typeface="Segoe UI"/>
-        <a:font script="Mymr" typeface="Myanmar Text"/>
-        <a:font script="Nkoo" typeface="Ebrima"/>
-        <a:font script="Olck" typeface="Nirmala UI"/>
-        <a:font script="Osma" typeface="Ebrima"/>
-        <a:font script="Phag" typeface="Phagspa"/>
-        <a:font script="Syrn" typeface="Estrangelo Edessa"/>
-        <a:font script="Syrj" typeface="Estrangelo Edessa"/>
-        <a:font script="Syre" typeface="Estrangelo Edessa"/>
-        <a:font script="Sora" typeface="Nirmala UI"/>
-        <a:font script="Tale" typeface="Microsoft Tai Le"/>
-        <a:font script="Talu" typeface="Microsoft New Tai Lue"/>
-        <a:font script="Tfng" typeface="Ebrima"/>
-      </a:majorFont>
-      <a:minorFont>
-        <a:latin typeface="Calibri" panose="020F0502020204030204"/>
-        <a:ea typeface=""/>
-        <a:cs typeface=""/>
-        <a:font script="Jpan" typeface="游明朝"/>
-        <a:font script="Hang" typeface="맑은 고딕"/>
-        <a:font script="Hans" typeface="等线"/>
-        <a:font script="Hant" typeface="新細明體"/>
-        <a:font script="Arab" typeface="Arial"/>
-        <a:font script="Hebr" typeface="Arial"/>
-        <a:font script="Thai" typeface="Cordia New"/>
-        <a:font script="Ethi" typeface="Nyala"/>
-        <a:font script="Beng" typeface="Vrinda"/>
-        <a:font script="Gujr" typeface="Shruti"/>
-        <a:font script="Khmr" typeface="DaunPenh"/>
-        <a:font script="Knda" typeface="Tunga"/>
-        <a:font script="Guru" typeface="Raavi"/>
-        <a:font script="Cans" typeface="Euphemia"/>
-        <a:font script="Cher" typeface="Plantagenet Cherokee"/>
-        <a:font script="Yiii" typeface="Microsoft Yi Baiti"/>
-        <a:font script="Tibt" typeface="Microsoft Himalaya"/>
-        <a:font script="Thaa" typeface="MV Boli"/>
-        <a:font script="Deva" typeface="Mangal"/>
-        <a:font script="Telu" typeface="Gautami"/>
-        <a:font script="Taml" typeface="Latha"/>
-        <a:font script="Syrc" typeface="Estrangelo Edessa"/>
-        <a:font script="Orya" typeface="Kalinga"/>
-        <a:font script="Mlym" typeface="Kartika"/>
-        <a:font script="Laoo" typeface="DokChampa"/>
-        <a:font script="Sinh" typeface="Iskoola Pota"/>
-        <a:font script="Mong" typeface="Mongolian Baiti"/>
-        <a:font script="Viet" typeface="Arial"/>
-        <a:font script="Uigh" typeface="Microsoft Uighur"/>
-        <a:font script="Geor" typeface="Sylfaen"/>
-        <a:font script="Armn" typeface="Arial"/>
-        <a:font script="Bugi" typeface="Leelawadee UI"/>
-        <a:font script="Bopo" typeface="Microsoft JhengHei"/>
-        <a:font script="Java" typeface="Javanese Text"/>
-        <a:font script="Lisu" typeface="Segoe UI"/>
-        <a:font script="Mymr" typeface="Myanmar Text"/>
-        <a:font script="Nkoo" typeface="Ebrima"/>
-        <a:font script="Olck" typeface="Nirmala UI"/>
-        <a:font script="Osma" typeface="Ebrima"/>
-        <a:font script="Phag" typeface="Phagspa"/>
-        <a:font script="Syrn" typeface="Estrangelo Edessa"/>
-        <a:font script="Syrj" typeface="Estrangelo Edessa"/>
-        <a:font script="Syre" typeface="Estrangelo Edessa"/>
-        <a:font script="Sora" typeface="Nirmala UI"/>
-        <a:font script="Tale" typeface="Microsoft Tai Le"/>
-        <a:font script="Talu" typeface="Microsoft New Tai Lue"/>
-        <a:font script="Tfng" typeface="Ebrima"/>
-      </a:minorFont>
-    </a:fontScheme>
-    <a:fmtScheme name="Office">
-      <a:fillStyleLst>
-        <a:solidFill>
-          <a:schemeClr val="phClr"/>
-        </a:solidFill>
-        <a:gradFill rotWithShape="true">
-          <a:gsLst>
-            <a:gs pos="0">
-              <a:schemeClr val="phClr">
-                <a:lumMod val="110000"/>
-                <a:satMod val="105000"/>
-                <a:tint val="67000"/>
-              </a:schemeClr>
-            </a:gs>
-            <a:gs pos="50000">
-              <a:schemeClr val="phClr">
-                <a:lumMod val="105000"/>
-                <a:satMod val="103000"/>
-                <a:tint val="73000"/>
-              </a:schemeClr>
-            </a:gs>
-            <a:gs pos="100000">
-              <a:schemeClr val="phClr">
-                <a:lumMod val="105000"/>
-                <a:satMod val="109000"/>
-                <a:tint val="81000"/>
-              </a:schemeClr>
-            </a:gs>
-          </a:gsLst>
-          <a:lin ang="5400000" scaled="false"/>
-        </a:gradFill>
-        <a:gradFill rotWithShape="true">
-          <a:gsLst>
-            <a:gs pos="0">
-              <a:schemeClr val="phClr">
-                <a:satMod val="103000"/>
-                <a:lumMod val="102000"/>
-                <a:tint val="94000"/>
-              </a:schemeClr>
-            </a:gs>
-            <a:gs pos="50000">
-              <a:schemeClr val="phClr">
-                <a:satMod val="110000"/>
-                <a:lumMod val="100000"/>
-                <a:shade val="100000"/>
-              </a:schemeClr>
-            </a:gs>
-            <a:gs pos="100000">
-              <a:schemeClr val="phClr">
-                <a:lumMod val="99000"/>
-                <a:satMod val="120000"/>
-                <a:shade val="78000"/>
-              </a:schemeClr>
-            </a:gs>
-          </a:gsLst>
-          <a:lin ang="5400000" scaled="false"/>
-        </a:gradFill>
-      </a:fillStyleLst>
-      <a:lnStyleLst>
-        <a:ln w="6350" cap="flat" cmpd="sng" algn="ctr">
-          <a:solidFill>
-            <a:schemeClr val="phClr"/>
-          </a:solidFill>
-          <a:prstDash val="solid"/>
-          <a:miter lim="800000"/>
-        </a:ln>
-        <a:ln w="12700" cap="flat" cmpd="sng" algn="ctr">
-          <a:solidFill>
-            <a:schemeClr val="phClr"/>
-          </a:solidFill>
-          <a:prstDash val="solid"/>
-          <a:miter lim="800000"/>
-        </a:ln>
-        <a:ln w="19050" cap="flat" cmpd="sng" algn="ctr">
-          <a:solidFill>
-            <a:schemeClr val="phClr"/>
-          </a:solidFill>
-          <a:prstDash val="solid"/>
-          <a:miter lim="800000"/>
-        </a:ln>
-      </a:lnStyleLst>
-      <a:effectStyleLst>
-        <a:effectStyle>
-          <a:effectLst/>
-        </a:effectStyle>
-        <a:effectStyle>
-          <a:effectLst/>
-        </a:effectStyle>
-        <a:effectStyle>
-          <a:effectLst>
-            <a:outerShdw blurRad="57150" dist="19050" dir="5400000" algn="ctr" rotWithShape="false">
-              <a:srgbClr val="000000">
-                <a:alpha val="63000"/>
-              </a:srgbClr>
-            </a:outerShdw>
-          </a:effectLst>
-        </a:effectStyle>
-      </a:effectStyleLst>
-      <a:bgFillStyleLst>
-        <a:solidFill>
-          <a:schemeClr val="phClr"/>
-        </a:solidFill>
-        <a:solidFill>
-          <a:schemeClr val="phClr">
-            <a:tint val="95000"/>
-            <a:satMod val="170000"/>
-          </a:schemeClr>
-        </a:solidFill>
-        <a:gradFill rotWithShape="true">
-          <a:gsLst>
-            <a:gs pos="0">
-              <a:schemeClr val="phClr">
-                <a:tint val="93000"/>
-                <a:satMod val="150000"/>
-                <a:shade val="98000"/>
-                <a:lumMod val="102000"/>
-              </a:schemeClr>
-            </a:gs>
-            <a:gs pos="50000">
-              <a:schemeClr val="phClr">
-                <a:tint val="98000"/>
-                <a:satMod val="130000"/>
-                <a:shade val="90000"/>
-                <a:lumMod val="103000"/>
-              </a:schemeClr>
-            </a:gs>
-            <a:gs pos="100000">
-              <a:schemeClr val="phClr">
-                <a:shade val="63000"/>
-                <a:satMod val="120000"/>
-              </a:schemeClr>
-            </a:gs>
-          </a:gsLst>
-          <a:lin ang="5400000" scaled="false"/>
-        </a:gradFill>
-      </a:bgFillStyleLst>
-    </a:fmtScheme>
-  </a:themeElements>
-  <a:objectDefaults/>
-  <a:extraClrSchemeLst/>
-</a:theme>
 </file>
</xml_diff>